<commit_message>
Clarify Spanish Luo pathway feedback
</commit_message>
<xml_diff>
--- a/study-guide/downloads/es/channels-mock-10/05_Canales_Luo_Connecting_Mock_10_ES.docx
+++ b/study-guide/downloads/es/channels-mock-10/05_Canales_Luo_Connecting_Mock_10_ES.docx
@@ -66,22 +66,22 @@
     <w:p/>
     <w:p>
       <w:r>
-        <w:t>3. ¿Cuál es la secuencia habitual descrita para una ruta Luo perteneciente a un canal principal?</w:t>
+        <w:t>3. ¿Cuál es la secuencia habitual de un canal Luo-Connecting que se origina en un canal principal?</w:t>
       </w:r>
     </w:p>
     <w:p>
       <w:r>
-        <w:t>A) Comienza en un zangfu, entra al cerebro y termina en un punto Jing-Well.</w:t>
+        <w:t>A) Comienza en un zangfu, entra en el cerebro y termina en un punto Jing-Well.</w:t>
       </w:r>
     </w:p>
     <w:p>
       <w:r>
-        <w:t>B) Se ramifica desde su punto Luo-Connecting, se une al canal interno-externo y generalmente continúa a lo largo de su propia ruta descrita. +++++</w:t>
+        <w:t>B) Se ramifica desde su punto Luo-Connecting, conecta con el canal acoplado por la relación interior–exterior y continúa por el trayecto específico descrito para ese Luo. +++++</w:t>
       </w:r>
     </w:p>
     <w:p>
       <w:r>
-        <w:t>C) Comienza en el canal emparejado y viaja sólo a la piel por encima de su punto de origen.</w:t>
+        <w:t>C) Comienza en el canal acoplado y circula únicamente por la piel situada por encima de su punto de origen.</w:t>
       </w:r>
     </w:p>
     <w:p>
@@ -91,7 +91,7 @@
     </w:p>
     <w:p>
       <w:r>
-        <w:t>Feedback: La respuesta correcta sigue el patrón declarado: el origen en el punto Luo-Connecting del canal, la conexión con el canal interna-externalmente emparejado, y la continuación a lo largo de la ruta descrita para ese Luo. Comenzando en un zangfu y terminando en un punto Jing-Well no describe ni la secuencia general de Luo ni su relación definitoria. Comenzando en el canal emparejado revierte la dirección de la relación rama declarada y limita incorrectamente la ruta. Transformar un vaso extraordinario en un canal divergente combina sistemas distintos y no es el patrón Luo.</w:t>
+        <w:t>Feedback: Respuesta correcta: se ramifica desde su punto Luo-Connecting, conecta con el canal acoplado por la relación interior–exterior y continúa por el trayecto específico de ese Luo. Esa secuencia define la relación habitual de los canales Luo-Connecting. La opción que comienza en un zangfu y termina en un punto Jing-Well es incorrecta porque no corresponde al recorrido general de estos canales. La opción que comienza en el canal acoplado es incorrecta porque invierte el origen de la ramificación y limita indebidamente su recorrido a la piel. La opción que transforma un vaso extraordinario en un canal divergente es incorrecta porque mezcla dos sistemas diferentes.</w:t>
       </w:r>
     </w:p>
     <w:p/>

</xml_diff>